<commit_message>
Payment % boxes, Category/Endpoint highlighting, CRO phone; updated forms
Payment conditions are Initiation/Completion/Report percentages (max 100%),
listing only the filled stages. Ticked Category and Endpoint words are
highlighted on the form. The CRO's phone is read from its own contact lines.
Board approval defaults to No. Updated Study Authorization Form and
EssGeeEss example with tighter spacing.
</commit_message>
<xml_diff>
--- a/templates/example-essgeeess.docx
+++ b/templates/example-essgeeess.docx
@@ -76,15 +76,6 @@
           <w:szCs w:val="24"/>
         </w:rPr>
         <w:tab/>
-      </w:r>
-      <w:r>
-        <w:rPr>
-          <w:rFonts w:ascii="Tahoma" w:hAnsi="Tahoma" w:cs="Tahoma"/>
-          <w:b/>
-          <w:sz w:val="24"/>
-          <w:szCs w:val="24"/>
-          <w:highlight w:val="yellow"/>
-        </w:rPr>
         <w:t>Safety Assessment</w:t>
       </w:r>
       <w:r>
@@ -206,7 +197,6 @@
           <w:b/>
           <w:sz w:val="24"/>
           <w:szCs w:val="24"/>
-          <w:highlight w:val="yellow"/>
         </w:rPr>
         <w:t>Skin Sensitization</w:t>
       </w:r>
@@ -354,16 +344,6 @@
           <w:szCs w:val="24"/>
         </w:rPr>
       </w:pPr>
-    </w:p>
-    <w:p>
-      <w:pPr>
-        <w:rPr>
-          <w:rFonts w:ascii="Tahoma" w:hAnsi="Tahoma" w:cs="Tahoma"/>
-          <w:bCs/>
-          <w:sz w:val="24"/>
-          <w:szCs w:val="24"/>
-        </w:rPr>
-      </w:pPr>
       <w:r>
         <w:rPr>
           <w:rFonts w:ascii="Tahoma" w:hAnsi="Tahoma" w:cs="Tahoma"/>
@@ -376,29 +356,16 @@
       <w:r>
         <w:rPr>
           <w:rFonts w:ascii="Tahoma" w:hAnsi="Tahoma" w:cs="Tahoma"/>
-          <w:b/>
-          <w:sz w:val="24"/>
-          <w:szCs w:val="24"/>
-        </w:rPr>
-        <w:t xml:space="preserve"> </w:t>
-      </w:r>
-      <w:proofErr w:type="spellStart"/>
-      <w:r>
-        <w:rPr>
-          <w:rFonts w:ascii="Tahoma" w:hAnsi="Tahoma" w:cs="Tahoma"/>
-          <w:bCs/>
-          <w:sz w:val="24"/>
-          <w:szCs w:val="24"/>
-        </w:rPr>
-        <w:t>EssGeeEss</w:t>
-      </w:r>
-      <w:proofErr w:type="spellEnd"/>
-    </w:p>
-    <w:p>
-      <w:pPr>
-        <w:rPr>
-          <w:rFonts w:ascii="Tahoma" w:hAnsi="Tahoma" w:cs="Tahoma"/>
-          <w:bCs/>
+          <w:b w:val="0"/>
+          <w:sz w:val="24"/>
+        </w:rPr>
+        <w:t xml:space="preserve"> EssGeeEss</w:t>
+      </w:r>
+    </w:p>
+    <w:p>
+      <w:pPr>
+        <w:rPr>
+          <w:rFonts w:ascii="Tahoma" w:hAnsi="Tahoma" w:cs="Tahoma"/>
           <w:sz w:val="24"/>
           <w:szCs w:val="24"/>
         </w:rPr>
@@ -415,27 +382,16 @@
       <w:r>
         <w:rPr>
           <w:rFonts w:ascii="Tahoma" w:hAnsi="Tahoma" w:cs="Tahoma"/>
-          <w:b/>
-          <w:sz w:val="24"/>
-          <w:szCs w:val="24"/>
-        </w:rPr>
-        <w:t xml:space="preserve"> </w:t>
-      </w:r>
-      <w:r>
-        <w:rPr>
-          <w:rFonts w:ascii="Tahoma" w:hAnsi="Tahoma" w:cs="Tahoma"/>
-          <w:bCs/>
-          <w:sz w:val="24"/>
-          <w:szCs w:val="24"/>
-        </w:rPr>
-        <w:t>+1 555-555-5555</w:t>
-      </w:r>
-    </w:p>
-    <w:p>
-      <w:pPr>
-        <w:rPr>
-          <w:rFonts w:ascii="Tahoma" w:hAnsi="Tahoma" w:cs="Tahoma"/>
-          <w:bCs/>
+          <w:b w:val="0"/>
+          <w:sz w:val="24"/>
+        </w:rPr>
+        <w:t xml:space="preserve"> +1 555-555-5555</w:t>
+      </w:r>
+    </w:p>
+    <w:p>
+      <w:pPr>
+        <w:rPr>
+          <w:rFonts w:ascii="Tahoma" w:hAnsi="Tahoma" w:cs="Tahoma"/>
           <w:sz w:val="24"/>
           <w:szCs w:val="24"/>
         </w:rPr>
@@ -449,21 +405,11 @@
         </w:rPr>
         <w:t>Invoice Number:</w:t>
       </w:r>
-      <w:r>
-        <w:rPr>
-          <w:rFonts w:ascii="Tahoma" w:hAnsi="Tahoma" w:cs="Tahoma"/>
-          <w:bCs/>
-          <w:sz w:val="24"/>
-          <w:szCs w:val="24"/>
-        </w:rPr>
-        <w:t xml:space="preserve"> </w:t>
-      </w:r>
-    </w:p>
-    <w:p>
-      <w:pPr>
-        <w:rPr>
-          <w:rFonts w:ascii="Tahoma" w:hAnsi="Tahoma" w:cs="Tahoma"/>
-          <w:bCs/>
+    </w:p>
+    <w:p>
+      <w:pPr>
+        <w:rPr>
+          <w:rFonts w:ascii="Tahoma" w:hAnsi="Tahoma" w:cs="Tahoma"/>
           <w:sz w:val="24"/>
           <w:szCs w:val="24"/>
         </w:rPr>
@@ -477,21 +423,12 @@
         </w:rPr>
         <w:t>Invoice Date:</w:t>
       </w:r>
-      <w:r>
-        <w:rPr>
-          <w:rFonts w:ascii="Tahoma" w:hAnsi="Tahoma" w:cs="Tahoma"/>
-          <w:bCs/>
-          <w:sz w:val="24"/>
-          <w:szCs w:val="24"/>
-        </w:rPr>
-        <w:t xml:space="preserve"> </w:t>
-      </w:r>
-    </w:p>
-    <w:p>
-      <w:pPr>
-        <w:rPr>
-          <w:rFonts w:ascii="Tahoma" w:hAnsi="Tahoma" w:cs="Tahoma"/>
-          <w:bCs/>
+    </w:p>
+    <w:p>
+      <w:pPr>
+        <w:rPr>
+          <w:rFonts w:ascii="Tahoma" w:hAnsi="Tahoma" w:cs="Tahoma"/>
+          <w:b/>
           <w:sz w:val="24"/>
           <w:szCs w:val="24"/>
         </w:rPr>
@@ -505,21 +442,11 @@
         </w:rPr>
         <w:t>Due Date:</w:t>
       </w:r>
-      <w:r>
-        <w:rPr>
-          <w:rFonts w:ascii="Tahoma" w:hAnsi="Tahoma" w:cs="Tahoma"/>
-          <w:bCs/>
-          <w:sz w:val="24"/>
-          <w:szCs w:val="24"/>
-        </w:rPr>
-        <w:t xml:space="preserve"> </w:t>
-      </w:r>
-    </w:p>
-    <w:p>
-      <w:pPr>
-        <w:rPr>
-          <w:rFonts w:ascii="Tahoma" w:hAnsi="Tahoma" w:cs="Tahoma"/>
-          <w:bCs/>
+    </w:p>
+    <w:p>
+      <w:pPr>
+        <w:rPr>
+          <w:rFonts w:ascii="Tahoma" w:hAnsi="Tahoma" w:cs="Tahoma"/>
           <w:sz w:val="24"/>
           <w:szCs w:val="24"/>
         </w:rPr>
@@ -536,27 +463,17 @@
       <w:r>
         <w:rPr>
           <w:rFonts w:ascii="Tahoma" w:hAnsi="Tahoma" w:cs="Tahoma"/>
-          <w:b/>
-          <w:sz w:val="24"/>
-          <w:szCs w:val="24"/>
-        </w:rPr>
-        <w:t xml:space="preserve"> </w:t>
-      </w:r>
-      <w:r>
-        <w:rPr>
-          <w:rFonts w:ascii="Tahoma" w:hAnsi="Tahoma" w:cs="Tahoma"/>
-          <w:bCs/>
-          <w:sz w:val="24"/>
-          <w:szCs w:val="24"/>
-        </w:rPr>
-        <w:t>Human Repeat Insult Patch Test (HRIPT)</w:t>
-      </w:r>
-    </w:p>
-    <w:p>
-      <w:pPr>
-        <w:rPr>
-          <w:rFonts w:ascii="Tahoma" w:hAnsi="Tahoma" w:cs="Tahoma"/>
-          <w:bCs/>
+          <w:b w:val="0"/>
+          <w:sz w:val="24"/>
+        </w:rPr>
+        <w:t xml:space="preserve"> Human Repeat Insult Patch Test (HRIPT)</w:t>
+      </w:r>
+    </w:p>
+    <w:p>
+      <w:pPr>
+        <w:rPr>
+          <w:rFonts w:ascii="Tahoma" w:hAnsi="Tahoma" w:cs="Tahoma"/>
+          <w:b/>
           <w:sz w:val="24"/>
           <w:szCs w:val="24"/>
         </w:rPr>
@@ -570,21 +487,11 @@
         </w:rPr>
         <w:t>Project Number/Name:</w:t>
       </w:r>
-      <w:r>
-        <w:rPr>
-          <w:rFonts w:ascii="Tahoma" w:hAnsi="Tahoma" w:cs="Tahoma"/>
-          <w:bCs/>
-          <w:sz w:val="24"/>
-          <w:szCs w:val="24"/>
-        </w:rPr>
-        <w:t xml:space="preserve"> </w:t>
-      </w:r>
-    </w:p>
-    <w:p>
-      <w:pPr>
-        <w:rPr>
-          <w:rFonts w:ascii="Tahoma" w:hAnsi="Tahoma" w:cs="Tahoma"/>
-          <w:bCs/>
+    </w:p>
+    <w:p>
+      <w:pPr>
+        <w:rPr>
+          <w:rFonts w:ascii="Tahoma" w:hAnsi="Tahoma" w:cs="Tahoma"/>
           <w:sz w:val="24"/>
           <w:szCs w:val="24"/>
         </w:rPr>
@@ -598,21 +505,12 @@
         </w:rPr>
         <w:t>Date Signed:</w:t>
       </w:r>
-      <w:r>
-        <w:rPr>
-          <w:rFonts w:ascii="Tahoma" w:hAnsi="Tahoma" w:cs="Tahoma"/>
-          <w:bCs/>
-          <w:sz w:val="24"/>
-          <w:szCs w:val="24"/>
-        </w:rPr>
-        <w:t xml:space="preserve"> </w:t>
-      </w:r>
-    </w:p>
-    <w:p>
-      <w:pPr>
-        <w:rPr>
-          <w:rFonts w:ascii="Tahoma" w:hAnsi="Tahoma" w:cs="Tahoma"/>
-          <w:bCs/>
+    </w:p>
+    <w:p>
+      <w:pPr>
+        <w:rPr>
+          <w:rFonts w:ascii="Tahoma" w:hAnsi="Tahoma" w:cs="Tahoma"/>
+          <w:b/>
           <w:sz w:val="24"/>
           <w:szCs w:val="24"/>
         </w:rPr>
@@ -647,27 +545,17 @@
       <w:r>
         <w:rPr>
           <w:rFonts w:ascii="Tahoma" w:hAnsi="Tahoma" w:cs="Tahoma"/>
-          <w:b/>
-          <w:sz w:val="24"/>
-          <w:szCs w:val="24"/>
-        </w:rPr>
-        <w:t xml:space="preserve"> </w:t>
-      </w:r>
-      <w:r>
-        <w:rPr>
-          <w:rFonts w:ascii="Tahoma" w:hAnsi="Tahoma" w:cs="Tahoma"/>
-          <w:bCs/>
-          <w:sz w:val="24"/>
-          <w:szCs w:val="24"/>
-        </w:rPr>
-        <w:t>$</w:t>
-      </w:r>
-    </w:p>
-    <w:p>
-      <w:pPr>
-        <w:rPr>
-          <w:rFonts w:ascii="Tahoma" w:hAnsi="Tahoma" w:cs="Tahoma"/>
-          <w:bCs/>
+          <w:b w:val="0"/>
+          <w:sz w:val="24"/>
+        </w:rPr>
+        <w:t xml:space="preserve"> $</w:t>
+      </w:r>
+    </w:p>
+    <w:p>
+      <w:pPr>
+        <w:rPr>
+          <w:rFonts w:ascii="Tahoma" w:hAnsi="Tahoma" w:cs="Tahoma"/>
+          <w:b/>
           <w:sz w:val="24"/>
           <w:szCs w:val="24"/>
         </w:rPr>
@@ -684,31 +572,22 @@
       <w:r>
         <w:rPr>
           <w:rFonts w:ascii="Tahoma" w:hAnsi="Tahoma" w:cs="Tahoma"/>
-          <w:bCs/>
-          <w:sz w:val="24"/>
-          <w:szCs w:val="24"/>
-        </w:rPr>
-        <w:t xml:space="preserve"> </w:t>
-      </w:r>
-      <w:r>
-        <w:rPr>
-          <w:rFonts w:ascii="Tahoma" w:hAnsi="Tahoma" w:cs="Tahoma"/>
-          <w:bCs/>
-          <w:sz w:val="24"/>
-          <w:szCs w:val="24"/>
-        </w:rPr>
-        <w:t>100% due upon study initiation</w:t>
-      </w:r>
-    </w:p>
-    <w:p>
-      <w:pPr>
-        <w:rPr>
-          <w:rFonts w:ascii="Tahoma" w:hAnsi="Tahoma" w:cs="Tahoma"/>
-          <w:bCs/>
-          <w:sz w:val="24"/>
-          <w:szCs w:val="24"/>
-        </w:rPr>
-      </w:pPr>
+          <w:b w:val="0"/>
+          <w:sz w:val="24"/>
+        </w:rPr>
+        <w:t xml:space="preserve"> 100% due upon study initiation</w:t>
+      </w:r>
+    </w:p>
+    <w:p>
+      <w:pPr>
+        <w:rPr>
+          <w:rFonts w:ascii="Tahoma" w:hAnsi="Tahoma" w:cs="Tahoma"/>
+          <w:b/>
+          <w:sz w:val="24"/>
+          <w:szCs w:val="24"/>
+        </w:rPr>
+      </w:pPr>
+      <w:proofErr w:type="gramStart"/>
       <w:r>
         <w:rPr>
           <w:rFonts w:ascii="Tahoma" w:hAnsi="Tahoma" w:cs="Tahoma"/>
@@ -718,15 +597,7 @@
         </w:rPr>
         <w:t>Board Approval Needed?</w:t>
       </w:r>
-      <w:r>
-        <w:rPr>
-          <w:rFonts w:ascii="Tahoma" w:hAnsi="Tahoma" w:cs="Tahoma"/>
-          <w:bCs/>
-          <w:sz w:val="24"/>
-          <w:szCs w:val="24"/>
-        </w:rPr>
-        <w:t xml:space="preserve"> </w:t>
-      </w:r>
+      <w:proofErr w:type="gramEnd"/>
     </w:p>
     <w:p>
       <w:pPr>
@@ -749,16 +620,6 @@
           <w:szCs w:val="24"/>
         </w:rPr>
       </w:pPr>
-    </w:p>
-    <w:p>
-      <w:pPr>
-        <w:rPr>
-          <w:rFonts w:ascii="Tahoma" w:hAnsi="Tahoma" w:cs="Tahoma"/>
-          <w:bCs/>
-          <w:sz w:val="24"/>
-          <w:szCs w:val="24"/>
-        </w:rPr>
-      </w:pPr>
       <w:r>
         <w:rPr>
           <w:rFonts w:ascii="Tahoma" w:hAnsi="Tahoma" w:cs="Tahoma"/>
@@ -768,21 +629,12 @@
         </w:rPr>
         <w:t>Date Testing Started:</w:t>
       </w:r>
-      <w:r>
-        <w:rPr>
-          <w:rFonts w:ascii="Tahoma" w:hAnsi="Tahoma" w:cs="Tahoma"/>
-          <w:bCs/>
-          <w:sz w:val="24"/>
-          <w:szCs w:val="24"/>
-        </w:rPr>
-        <w:t xml:space="preserve"> </w:t>
-      </w:r>
-    </w:p>
-    <w:p>
-      <w:pPr>
-        <w:rPr>
-          <w:rFonts w:ascii="Tahoma" w:hAnsi="Tahoma" w:cs="Tahoma"/>
-          <w:bCs/>
+    </w:p>
+    <w:p>
+      <w:pPr>
+        <w:rPr>
+          <w:rFonts w:ascii="Tahoma" w:hAnsi="Tahoma" w:cs="Tahoma"/>
+          <w:b/>
           <w:sz w:val="24"/>
           <w:szCs w:val="24"/>
         </w:rPr>
@@ -796,21 +648,12 @@
         </w:rPr>
         <w:t>Estimated Date for Testing Completion/Draft Report:</w:t>
       </w:r>
-      <w:r>
-        <w:rPr>
-          <w:rFonts w:ascii="Tahoma" w:hAnsi="Tahoma" w:cs="Tahoma"/>
-          <w:bCs/>
-          <w:sz w:val="24"/>
-          <w:szCs w:val="24"/>
-        </w:rPr>
-        <w:t xml:space="preserve"> </w:t>
-      </w:r>
-    </w:p>
-    <w:p>
-      <w:pPr>
-        <w:rPr>
-          <w:rFonts w:ascii="Tahoma" w:hAnsi="Tahoma" w:cs="Tahoma"/>
-          <w:bCs/>
+    </w:p>
+    <w:p>
+      <w:pPr>
+        <w:rPr>
+          <w:rFonts w:ascii="Tahoma" w:hAnsi="Tahoma" w:cs="Tahoma"/>
+          <w:b/>
           <w:sz w:val="24"/>
           <w:szCs w:val="24"/>
         </w:rPr>
@@ -824,35 +667,6 @@
         </w:rPr>
         <w:t>Materials being tested:</w:t>
       </w:r>
-      <w:r>
-        <w:rPr>
-          <w:rFonts w:ascii="Tahoma" w:hAnsi="Tahoma" w:cs="Tahoma"/>
-          <w:bCs/>
-          <w:sz w:val="24"/>
-          <w:szCs w:val="24"/>
-        </w:rPr>
-        <w:t xml:space="preserve"> </w:t>
-      </w:r>
-    </w:p>
-    <w:p>
-      <w:pPr>
-        <w:rPr>
-          <w:rFonts w:ascii="Tahoma" w:hAnsi="Tahoma" w:cs="Tahoma"/>
-          <w:bCs/>
-          <w:sz w:val="24"/>
-          <w:szCs w:val="24"/>
-        </w:rPr>
-      </w:pPr>
-    </w:p>
-    <w:p>
-      <w:pPr>
-        <w:rPr>
-          <w:rFonts w:ascii="Tahoma" w:hAnsi="Tahoma" w:cs="Tahoma"/>
-          <w:bCs/>
-          <w:sz w:val="24"/>
-          <w:szCs w:val="24"/>
-        </w:rPr>
-      </w:pPr>
     </w:p>
     <w:p>
       <w:pPr>
@@ -870,17 +684,7 @@
       <w:pPr>
         <w:rPr>
           <w:rFonts w:ascii="Tahoma" w:hAnsi="Tahoma" w:cs="Tahoma"/>
-          <w:bCs/>
-          <w:sz w:val="24"/>
-          <w:szCs w:val="24"/>
-        </w:rPr>
-      </w:pPr>
-    </w:p>
-    <w:p>
-      <w:pPr>
-        <w:rPr>
-          <w:rFonts w:ascii="Tahoma" w:hAnsi="Tahoma" w:cs="Tahoma"/>
-          <w:bCs/>
+          <w:b/>
           <w:sz w:val="24"/>
           <w:szCs w:val="24"/>
         </w:rPr>
@@ -894,31 +698,6 @@
         </w:rPr>
         <w:t>Other Notes:</w:t>
       </w:r>
-      <w:r>
-        <w:rPr>
-          <w:rFonts w:ascii="Tahoma" w:hAnsi="Tahoma" w:cs="Tahoma"/>
-          <w:bCs/>
-          <w:sz w:val="24"/>
-          <w:szCs w:val="24"/>
-        </w:rPr>
-        <w:t xml:space="preserve"> </w:t>
-      </w:r>
-    </w:p>
-    <w:p>
-      <w:pPr>
-        <w:rPr>
-          <w:rFonts w:ascii="Tahoma" w:hAnsi="Tahoma" w:cs="Tahoma"/>
-          <w:b/>
-        </w:rPr>
-      </w:pPr>
-    </w:p>
-    <w:p>
-      <w:pPr>
-        <w:rPr>
-          <w:rFonts w:ascii="Tahoma" w:hAnsi="Tahoma" w:cs="Tahoma"/>
-          <w:b/>
-        </w:rPr>
-      </w:pPr>
     </w:p>
     <w:p>
       <w:pPr>

</xml_diff>

<commit_message>
Keep highlighted words whole; EssGeeEss payment says 100% Initiation
Highlighting joins a word Word had split across runs (Environmental,
Repeat Dose/Reproduction) into one run, and both bundled forms store those
words as one run.
</commit_message>
<xml_diff>
--- a/templates/example-essgeeess.docx
+++ b/templates/example-essgeeess.docx
@@ -162,16 +162,7 @@
           <w:sz w:val="24"/>
           <w:szCs w:val="24"/>
         </w:rPr>
-        <w:t>Repeat Dose</w:t>
-      </w:r>
-      <w:r>
-        <w:rPr>
-          <w:rFonts w:ascii="Tahoma" w:hAnsi="Tahoma" w:cs="Tahoma"/>
-          <w:b/>
-          <w:sz w:val="24"/>
-          <w:szCs w:val="24"/>
-        </w:rPr>
-        <w:t>/Reproduction</w:t>
+        <w:t xml:space="preserve">Repeat Dose/Reproduction</w:t>
       </w:r>
       <w:r>
         <w:rPr>
@@ -255,16 +246,7 @@
           <w:sz w:val="24"/>
           <w:szCs w:val="24"/>
         </w:rPr>
-        <w:t>Environmenta</w:t>
-      </w:r>
-      <w:r>
-        <w:rPr>
-          <w:rFonts w:ascii="Tahoma" w:hAnsi="Tahoma" w:cs="Tahoma"/>
-          <w:b/>
-          <w:sz w:val="24"/>
-          <w:szCs w:val="24"/>
-        </w:rPr>
-        <w:t>l</w:t>
+        <w:t xml:space="preserve">Environmental</w:t>
       </w:r>
     </w:p>
     <w:p>
@@ -284,16 +266,7 @@
           <w:sz w:val="24"/>
           <w:szCs w:val="24"/>
         </w:rPr>
-        <w:t>Exposu</w:t>
-      </w:r>
-      <w:r>
-        <w:rPr>
-          <w:rFonts w:ascii="Tahoma" w:hAnsi="Tahoma" w:cs="Tahoma"/>
-          <w:b/>
-          <w:sz w:val="24"/>
-          <w:szCs w:val="24"/>
-        </w:rPr>
-        <w:t>re</w:t>
+        <w:t xml:space="preserve">Exposure</w:t>
       </w:r>
       <w:r>
         <w:rPr>
@@ -575,7 +548,7 @@
           <w:b w:val="0"/>
           <w:sz w:val="24"/>
         </w:rPr>
-        <w:t xml:space="preserve"> 100% due upon study initiation</w:t>
+        <w:t xml:space="preserve"> 100% Initiation</w:t>
       </w:r>
     </w:p>
     <w:p>

</xml_diff>